<commit_message>
Fix three stale numbers in the one-page NAR proposal, unmaintained since it was written
This proposal document (written 2026-08-25) has no builder script and is not tracked by
tools/check_freshness.py, unlike every other document in this project, so it never picked up the
corrections made to the manuscript since: specificity was still stated as 94.9% against the current,
correct 92.5%; the FDA-curated external validation figure was still 0.793 on 241 compounds against
the current 0.767 on 227; and the falsification suite was stated as nine hypotheses when
inversion/results/VERDICTS.csv has always held ten (H1-H10) — the "four refuted" count was already
correct and unchanged. Found while researching NAR's actual Web Server Issue submission process,
which gates the full manuscript behind a one-page proposal submitted and approved first.

Co-Authored-By: Claude Sonnet 5 <noreply@anthropic.com>
</commit_message>
<xml_diff>
--- a/manuscript/NAR_proposal_onepage.docx
+++ b/manuscript/NAR_proposal_onepage.docx
@@ -2,7 +2,7 @@
 <file path=word/document.xml><?xml version="1.0" encoding="utf-8"?>
 <w:document xmlns:w="http://schemas.openxmlformats.org/wordprocessingml/2006/main" xmlns:m="http://schemas.openxmlformats.org/officeDocument/2006/math" xmlns:r="http://schemas.openxmlformats.org/officeDocument/2006/relationships" xmlns:o="urn:schemas-microsoft-com:office:office" xmlns:v="urn:schemas-microsoft-com:vml" xmlns:w10="urn:schemas-microsoft-com:office:word" xmlns:a="http://schemas.openxmlformats.org/drawingml/2006/main" xmlns:pic="http://schemas.openxmlformats.org/drawingml/2006/picture" xmlns:wp="http://schemas.openxmlformats.org/drawingml/2006/wordprocessingDrawing">
   <w:body>
-    <w:bookmarkStart w:id="9" w:name="X9dad279826c4f1524d9fc34a93d587e82133be1"/>
+    <w:bookmarkStart w:id="18" w:name="X9dad279826c4f1524d9fc34a93d587e82133be1"/>
     <w:p>
       <w:pPr>
         <w:pStyle w:val="Heading1"/>
@@ -341,19 +341,19 @@
         <w:t xml:space="preserve"> </w:t>
       </w:r>
       <w:r>
-        <w:t xml:space="preserve">and 0.793 on the 241 also distinguishable from training in feature space. On 1,000 compounds with no</w:t>
-      </w:r>
-      <w:r>
-        <w:t xml:space="preserve"> </w:t>
-      </w:r>
-      <w:r>
-        <w:t xml:space="preserve">recorded activity at any modelled target the server stays silent 94.9% of the time; those compounds</w:t>
-      </w:r>
-      <w:r>
-        <w:t xml:space="preserve"> </w:t>
-      </w:r>
-      <w:r>
-        <w:t xml:space="preserve">are presumed rather than proven inactive, so that figure is a lower bound. Nine falsification</w:t>
+        <w:t xml:space="preserve">and 0.767 on the 227 also distinguishable from training in feature space. On 1,000 compounds with no</w:t>
+      </w:r>
+      <w:r>
+        <w:t xml:space="preserve"> </w:t>
+      </w:r>
+      <w:r>
+        <w:t xml:space="preserve">recorded activity at any modelled target the server stays silent 92.5% of the time; those compounds</w:t>
+      </w:r>
+      <w:r>
+        <w:t xml:space="preserve"> </w:t>
+      </w:r>
+      <w:r>
+        <w:t xml:space="preserve">are presumed rather than proven inactive, so that figure is a lower bound. Ten falsification</w:t>
       </w:r>
       <w:r>
         <w:t xml:space="preserve"> </w:t>
@@ -488,11 +488,15 @@
         <w:t xml:space="preserve">rejected by, the Web Server Issue in any previous year.</w:t>
       </w:r>
     </w:p>
-    <w:bookmarkEnd w:id="9"/>
+    <w:bookmarkEnd w:id="18"/>
     <w:sectPr>
+      <w:footerReference r:id="rId9" w:type="default"/>
       <w:footnotePr>
         <w:numRestart w:val="eachSect"/>
       </w:footnotePr>
+      <w:pgSz w:h="16838" w:w="11906"/>
+      <w:pgMar w:bottom="1440" w:left="1440" w:right="1440" w:top="1440"/>
+      <w:lnNumType w:countBy="1" w:distance="360" w:restart="continuous"/>
     </w:sectPr>
   </w:body>
 </w:document>
@@ -500,6 +504,26 @@
 
 <file path=word/comments.xml><?xml version="1.0" encoding="utf-8"?>
 <w:comments xmlns:w="http://schemas.openxmlformats.org/wordprocessingml/2006/main" xmlns:m="http://schemas.openxmlformats.org/officeDocument/2006/math" xmlns:r="http://schemas.openxmlformats.org/officeDocument/2006/relationships" xmlns:o="urn:schemas-microsoft-com:office:office" xmlns:v="urn:schemas-microsoft-com:vml" xmlns:w10="urn:schemas-microsoft-com:office:word" xmlns:a="http://schemas.openxmlformats.org/drawingml/2006/main" xmlns:pic="http://schemas.openxmlformats.org/drawingml/2006/picture" xmlns:wp="http://schemas.openxmlformats.org/drawingml/2006/wordprocessingDrawing"/>
+</file>
+
+<file path=word/footer1.xml><?xml version="1.0" encoding="utf-8"?>
+<w:ftr xmlns:m="http://schemas.openxmlformats.org/officeDocument/2006/math" xmlns:mc="http://schemas.openxmlformats.org/markup-compatibility/2006" xmlns:mo="http://schemas.microsoft.com/office/mac/office/2008/main" xmlns:mv="urn:schemas-microsoft-com:mac:vml" xmlns:o="urn:schemas-microsoft-com:office:office" xmlns:r="http://schemas.openxmlformats.org/officeDocument/2006/relationships" xmlns:v="urn:schemas-microsoft-com:vml" xmlns:w10="urn:schemas-microsoft-com:office:word" xmlns:w14="http://schemas.microsoft.com/office/word/2010/wordml" xmlns:w="http://schemas.openxmlformats.org/wordprocessingml/2006/main" xmlns:wne="http://schemas.microsoft.com/office/word/2006/wordml" xmlns:wp14="http://schemas.microsoft.com/office/word/2010/wordprocessingDrawing" xmlns:wp="http://schemas.openxmlformats.org/drawingml/2006/wordprocessingDrawing" xmlns:wpc="http://schemas.microsoft.com/office/word/2010/wordprocessingCanvas" xmlns:wpg="http://schemas.microsoft.com/office/word/2010/wordprocessingGroup" xmlns:wpi="http://schemas.microsoft.com/office/word/2010/wordprocessingInk" xmlns:wps="http://schemas.microsoft.com/office/word/2010/wordprocessingShape" mc:Ignorable="w14 wp14">
+  <w:p>
+    <w:pPr>
+      <w:suppressLineNumbers/>
+      <w:jc w:val="center"/>
+    </w:pPr>
+    <w:r>
+      <w:rPr>
+        <w:rFonts w:ascii="Times New Roman" w:hAnsi="Times New Roman"/>
+        <w:sz w:val="20"/>
+      </w:rPr>
+      <w:fldChar w:fldCharType="begin"/>
+      <w:instrText xml:space="preserve"> PAGE </w:instrText>
+      <w:fldChar w:fldCharType="end"/>
+    </w:r>
+  </w:p>
+</w:ftr>
 </file>
 
 <file path=word/footnotes.xml><?xml version="1.0" encoding="utf-8"?>
@@ -626,6 +650,14 @@
   <w:style w:default="1" w:styleId="Normal" w:type="paragraph">
     <w:name w:val="Normal"/>
     <w:qFormat/>
+    <w:pPr>
+      <w:spacing w:after="200" w:before="0" w:line="240" w:lineRule="auto"/>
+      <w:jc w:val="left"/>
+    </w:pPr>
+    <w:rPr>
+      <w:rFonts w:ascii="Times New Roman" w:cs="Times New Roman" w:hAnsi="Times New Roman"/>
+      <w:sz w:val="24"/>
+    </w:rPr>
   </w:style>
   <w:style w:styleId="BodyText" w:type="paragraph">
     <w:name w:val="Body Text"/>
@@ -633,22 +665,40 @@
     <w:link w:val="BodyTextChar"/>
     <w:qFormat/>
     <w:pPr>
-      <w:spacing w:after="180" w:before="180"/>
-    </w:pPr>
+      <w:spacing w:after="200" w:before="0" w:line="240" w:lineRule="auto"/>
+      <w:jc w:val="left"/>
+    </w:pPr>
+    <w:rPr>
+      <w:rFonts w:ascii="Times New Roman" w:cs="Times New Roman" w:hAnsi="Times New Roman"/>
+      <w:sz w:val="24"/>
+    </w:rPr>
   </w:style>
   <w:style w:customStyle="1" w:styleId="FirstParagraph" w:type="paragraph">
     <w:name w:val="First Paragraph"/>
     <w:basedOn w:val="BodyText"/>
     <w:next w:val="BodyText"/>
     <w:qFormat/>
+    <w:pPr>
+      <w:spacing w:after="200" w:before="0" w:line="240" w:lineRule="auto"/>
+      <w:jc w:val="left"/>
+    </w:pPr>
+    <w:rPr>
+      <w:rFonts w:ascii="Times New Roman" w:cs="Times New Roman" w:hAnsi="Times New Roman"/>
+      <w:sz w:val="24"/>
+    </w:rPr>
   </w:style>
   <w:style w:customStyle="1" w:styleId="Compact" w:type="paragraph">
     <w:name w:val="Compact"/>
     <w:basedOn w:val="BodyText"/>
     <w:qFormat/>
     <w:pPr>
-      <w:spacing w:after="36" w:before="36"/>
-    </w:pPr>
+      <w:spacing w:after="200" w:before="0" w:line="240" w:lineRule="auto"/>
+      <w:jc w:val="left"/>
+    </w:pPr>
+    <w:rPr>
+      <w:rFonts w:ascii="Times New Roman" w:cs="Times New Roman" w:hAnsi="Times New Roman"/>
+      <w:sz w:val="24"/>
+    </w:rPr>
   </w:style>
   <w:style w:styleId="Title" w:type="paragraph">
     <w:name w:val="Title"/>
@@ -659,13 +709,15 @@
     <w:qFormat/>
     <w:rsid w:val="00A10FD9"/>
     <w:pPr>
-      <w:spacing w:after="80" w:line="240" w:lineRule="auto"/>
+      <w:spacing w:after="240" w:before="0" w:line="276" w:lineRule="auto"/>
       <w:contextualSpacing/>
-      <w:jc w:val="center"/>
-    </w:pPr>
-    <w:rPr>
-      <w:rFonts w:asciiTheme="majorHAnsi" w:cstheme="majorBidi" w:eastAsiaTheme="majorEastAsia" w:hAnsiTheme="majorHAnsi"/>
-      <w:sz w:val="56"/>
+      <w:jc w:val="left"/>
+    </w:pPr>
+    <w:rPr>
+      <w:rFonts w:ascii="Times New Roman" w:asciiTheme="majorHAnsi" w:cs="Times New Roman" w:cstheme="majorBidi" w:eastAsiaTheme="majorEastAsia" w:hAnsi="Times New Roman" w:hAnsiTheme="majorHAnsi"/>
+      <w:b/>
+      <w:color w:val="000000"/>
+      <w:sz w:val="32"/>
       <w:szCs w:val="56"/>
     </w:rPr>
   </w:style>
@@ -677,6 +729,7 @@
     <w:rsid w:val="00A10FD9"/>
     <w:rPr>
       <w:rFonts w:asciiTheme="majorHAnsi" w:cstheme="majorBidi" w:eastAsiaTheme="majorEastAsia" w:hAnsiTheme="majorHAnsi"/>
+      <w:color w:val="000000"/>
       <w:sz w:val="56"/>
       <w:szCs w:val="56"/>
     </w:rPr>
@@ -693,11 +746,15 @@
       <w:numPr>
         <w:ilvl w:val="1"/>
       </w:numPr>
-    </w:pPr>
-    <w:rPr>
-      <w:rFonts w:cstheme="majorBidi" w:eastAsiaTheme="majorEastAsia"/>
+      <w:spacing w:after="120" w:before="0" w:line="240" w:lineRule="auto"/>
+      <w:jc w:val="left"/>
+    </w:pPr>
+    <w:rPr>
+      <w:rFonts w:ascii="Times New Roman" w:cs="Times New Roman" w:cstheme="majorBidi" w:eastAsiaTheme="majorEastAsia" w:hAnsi="Times New Roman"/>
+      <w:i/>
+      <w:color w:val="000000"/>
       <w:spacing w:val="15"/>
-      <w:sz w:val="28"/>
+      <w:sz w:val="24"/>
       <w:szCs w:val="28"/>
     </w:rPr>
   </w:style>
@@ -709,7 +766,7 @@
     <w:rsid w:val="00A10FD9"/>
     <w:rPr>
       <w:rFonts w:cstheme="majorBidi" w:eastAsiaTheme="majorEastAsia"/>
-      <w:color w:themeColor="text1" w:themeTint="A6" w:val="595959"/>
+      <w:color w:val="000000"/>
       <w:spacing w:val="15"/>
       <w:sz w:val="28"/>
       <w:szCs w:val="28"/>
@@ -723,8 +780,11 @@
     <w:pPr>
       <w:keepNext/>
       <w:keepLines/>
-    </w:pPr>
-    <w:rPr>
+      <w:spacing w:after="80" w:before="0" w:line="240" w:lineRule="auto"/>
+      <w:jc w:val="left"/>
+    </w:pPr>
+    <w:rPr>
+      <w:rFonts w:ascii="Times New Roman" w:cs="Times New Roman" w:hAnsi="Times New Roman"/>
       <w:sz w:val="24"/>
       <w:szCs w:val="24"/>
     </w:rPr>
@@ -737,8 +797,11 @@
     <w:pPr>
       <w:keepNext/>
       <w:keepLines/>
-    </w:pPr>
-    <w:rPr>
+      <w:spacing w:after="200" w:before="0" w:line="240" w:lineRule="auto"/>
+      <w:jc w:val="left"/>
+    </w:pPr>
+    <w:rPr>
+      <w:rFonts w:ascii="Times New Roman" w:cs="Times New Roman" w:hAnsi="Times New Roman"/>
       <w:sz w:val="24"/>
       <w:szCs w:val="24"/>
     </w:rPr>
@@ -751,12 +814,13 @@
     <w:pPr>
       <w:keepNext/>
       <w:keepLines/>
-      <w:spacing w:after="0" w:before="300"/>
-      <w:jc w:val="center"/>
-    </w:pPr>
-    <w:rPr>
-      <w:b/>
-      <w:sz w:val="20"/>
+      <w:spacing w:after="80" w:before="120" w:line="240" w:lineRule="auto"/>
+      <w:jc w:val="left"/>
+    </w:pPr>
+    <w:rPr>
+      <w:rFonts w:ascii="Times New Roman" w:cs="Times New Roman" w:hAnsi="Times New Roman"/>
+      <w:b/>
+      <w:sz w:val="24"/>
       <w:szCs w:val="20"/>
     </w:rPr>
   </w:style>
@@ -768,10 +832,12 @@
     <w:pPr>
       <w:keepNext/>
       <w:keepLines/>
-      <w:spacing w:after="300" w:before="100"/>
-    </w:pPr>
-    <w:rPr>
-      <w:sz w:val="20"/>
+      <w:spacing w:after="200" w:before="0" w:line="240" w:lineRule="auto"/>
+      <w:jc w:val="left"/>
+    </w:pPr>
+    <w:rPr>
+      <w:rFonts w:ascii="Times New Roman" w:cs="Times New Roman" w:hAnsi="Times New Roman"/>
+      <w:sz w:val="24"/>
       <w:szCs w:val="20"/>
     </w:rPr>
   </w:style>
@@ -780,8 +846,15 @@
     <w:basedOn w:val="Normal"/>
     <w:next w:val="Bibliography"/>
     <w:qFormat/>
-    <w:pPr/>
-    <w:rPr/>
+    <w:pPr>
+      <w:spacing w:after="120" w:before="0" w:line="240" w:lineRule="auto"/>
+      <w:ind w:hanging="357"/>
+      <w:jc w:val="left"/>
+    </w:pPr>
+    <w:rPr>
+      <w:rFonts w:ascii="Times New Roman" w:cs="Times New Roman" w:hAnsi="Times New Roman"/>
+      <w:sz w:val="22"/>
+    </w:rPr>
   </w:style>
   <w:style w:styleId="Heading1" w:type="paragraph">
     <w:name w:val="heading 1"/>
@@ -794,13 +867,15 @@
     <w:pPr>
       <w:keepNext/>
       <w:keepLines/>
-      <w:spacing w:after="80" w:before="360"/>
+      <w:spacing w:after="160" w:before="360" w:line="240" w:lineRule="auto"/>
+      <w:jc w:val="left"/>
       <w:outlineLvl w:val="0"/>
     </w:pPr>
     <w:rPr>
-      <w:rFonts w:asciiTheme="majorHAnsi" w:cstheme="majorBidi" w:eastAsiaTheme="majorEastAsia" w:hAnsiTheme="majorHAnsi"/>
-      <w:color w:themeColor="accent1" w:themeShade="BF" w:val="0F4761"/>
-      <w:sz w:val="40"/>
+      <w:rFonts w:ascii="Times New Roman" w:asciiTheme="majorHAnsi" w:cs="Times New Roman" w:cstheme="majorBidi" w:eastAsiaTheme="majorEastAsia" w:hAnsi="Times New Roman" w:hAnsiTheme="majorHAnsi"/>
+      <w:b/>
+      <w:color w:val="000000"/>
+      <w:sz w:val="28"/>
       <w:szCs w:val="40"/>
     </w:rPr>
   </w:style>
@@ -817,13 +892,15 @@
     <w:pPr>
       <w:keepNext/>
       <w:keepLines/>
-      <w:spacing w:after="80" w:before="160"/>
+      <w:spacing w:after="120" w:before="280" w:line="240" w:lineRule="auto"/>
+      <w:jc w:val="left"/>
       <w:outlineLvl w:val="1"/>
     </w:pPr>
     <w:rPr>
-      <w:rFonts w:asciiTheme="majorHAnsi" w:cstheme="majorBidi" w:eastAsiaTheme="majorEastAsia" w:hAnsiTheme="majorHAnsi"/>
-      <w:color w:themeColor="accent1" w:themeShade="BF" w:val="0F4761"/>
-      <w:sz w:val="32"/>
+      <w:rFonts w:ascii="Times New Roman" w:asciiTheme="majorHAnsi" w:cs="Times New Roman" w:cstheme="majorBidi" w:eastAsiaTheme="majorEastAsia" w:hAnsi="Times New Roman" w:hAnsiTheme="majorHAnsi"/>
+      <w:b/>
+      <w:color w:val="000000"/>
+      <w:sz w:val="26"/>
       <w:szCs w:val="32"/>
     </w:rPr>
   </w:style>
@@ -840,13 +917,16 @@
     <w:pPr>
       <w:keepNext/>
       <w:keepLines/>
-      <w:spacing w:after="80" w:before="160"/>
+      <w:spacing w:after="120" w:before="240" w:line="240" w:lineRule="auto"/>
+      <w:jc w:val="left"/>
       <w:outlineLvl w:val="2"/>
     </w:pPr>
     <w:rPr>
-      <w:rFonts w:cstheme="majorBidi" w:eastAsiaTheme="majorEastAsia"/>
-      <w:color w:themeColor="accent1" w:themeShade="BF" w:val="0F4761"/>
-      <w:sz w:val="28"/>
+      <w:rFonts w:ascii="Times New Roman" w:cs="Times New Roman" w:cstheme="majorBidi" w:eastAsiaTheme="majorEastAsia" w:hAnsi="Times New Roman"/>
+      <w:b/>
+      <w:i/>
+      <w:color w:val="000000"/>
+      <w:sz w:val="24"/>
       <w:szCs w:val="28"/>
     </w:rPr>
   </w:style>
@@ -863,14 +943,17 @@
     <w:pPr>
       <w:keepNext/>
       <w:keepLines/>
-      <w:spacing w:after="40" w:before="80"/>
+      <w:spacing w:after="80" w:before="200" w:line="240" w:lineRule="auto"/>
+      <w:jc w:val="left"/>
       <w:outlineLvl w:val="3"/>
     </w:pPr>
     <w:rPr>
-      <w:rFonts w:cstheme="majorBidi" w:eastAsiaTheme="majorEastAsia"/>
+      <w:rFonts w:ascii="Times New Roman" w:cs="Times New Roman" w:cstheme="majorBidi" w:eastAsiaTheme="majorEastAsia" w:hAnsi="Times New Roman"/>
+      <w:b/>
       <w:i/>
       <w:iCs/>
-      <w:color w:themeColor="accent1" w:themeShade="BF" w:val="0F4761"/>
+      <w:color w:val="000000"/>
+      <w:sz w:val="24"/>
     </w:rPr>
   </w:style>
   <w:style w:styleId="Heading5" w:type="paragraph">
@@ -886,12 +969,16 @@
     <w:pPr>
       <w:keepNext/>
       <w:keepLines/>
-      <w:spacing w:after="40" w:before="80"/>
+      <w:spacing w:after="80" w:before="200" w:line="240" w:lineRule="auto"/>
+      <w:jc w:val="left"/>
       <w:outlineLvl w:val="4"/>
     </w:pPr>
     <w:rPr>
-      <w:rFonts w:cstheme="majorBidi" w:eastAsiaTheme="majorEastAsia"/>
-      <w:color w:themeColor="accent1" w:themeShade="BF" w:val="0F4761"/>
+      <w:rFonts w:ascii="Times New Roman" w:cs="Times New Roman" w:cstheme="majorBidi" w:eastAsiaTheme="majorEastAsia" w:hAnsi="Times New Roman"/>
+      <w:b/>
+      <w:i/>
+      <w:color w:val="000000"/>
+      <w:sz w:val="24"/>
     </w:rPr>
   </w:style>
   <w:style w:styleId="Heading6" w:type="paragraph">
@@ -907,14 +994,17 @@
     <w:pPr>
       <w:keepNext/>
       <w:keepLines/>
-      <w:spacing w:after="0" w:before="40"/>
+      <w:spacing w:after="80" w:before="200" w:line="240" w:lineRule="auto"/>
+      <w:jc w:val="left"/>
       <w:outlineLvl w:val="5"/>
     </w:pPr>
     <w:rPr>
-      <w:rFonts w:cstheme="majorBidi" w:eastAsiaTheme="majorEastAsia"/>
+      <w:rFonts w:ascii="Times New Roman" w:cs="Times New Roman" w:cstheme="majorBidi" w:eastAsiaTheme="majorEastAsia" w:hAnsi="Times New Roman"/>
+      <w:b/>
       <w:i/>
       <w:iCs/>
-      <w:color w:themeColor="text1" w:themeTint="A6" w:val="595959"/>
+      <w:color w:val="000000"/>
+      <w:sz w:val="24"/>
     </w:rPr>
   </w:style>
   <w:style w:styleId="Heading7" w:type="paragraph">
@@ -930,12 +1020,16 @@
     <w:pPr>
       <w:keepNext/>
       <w:keepLines/>
-      <w:spacing w:after="0" w:before="40"/>
+      <w:spacing w:after="80" w:before="200" w:line="240" w:lineRule="auto"/>
+      <w:jc w:val="left"/>
       <w:outlineLvl w:val="6"/>
     </w:pPr>
     <w:rPr>
-      <w:rFonts w:cstheme="majorBidi" w:eastAsiaTheme="majorEastAsia"/>
-      <w:color w:themeColor="text1" w:themeTint="A6" w:val="595959"/>
+      <w:rFonts w:ascii="Times New Roman" w:cs="Times New Roman" w:cstheme="majorBidi" w:eastAsiaTheme="majorEastAsia" w:hAnsi="Times New Roman"/>
+      <w:b/>
+      <w:i/>
+      <w:color w:val="000000"/>
+      <w:sz w:val="24"/>
     </w:rPr>
   </w:style>
   <w:style w:styleId="Heading8" w:type="paragraph">
@@ -951,14 +1045,17 @@
     <w:pPr>
       <w:keepNext/>
       <w:keepLines/>
-      <w:spacing w:after="0"/>
+      <w:spacing w:after="80" w:before="200" w:line="240" w:lineRule="auto"/>
+      <w:jc w:val="left"/>
       <w:outlineLvl w:val="7"/>
     </w:pPr>
     <w:rPr>
-      <w:rFonts w:cstheme="majorBidi" w:eastAsiaTheme="majorEastAsia"/>
+      <w:rFonts w:ascii="Times New Roman" w:cs="Times New Roman" w:cstheme="majorBidi" w:eastAsiaTheme="majorEastAsia" w:hAnsi="Times New Roman"/>
+      <w:b/>
       <w:i/>
       <w:iCs/>
-      <w:color w:themeColor="text1" w:themeTint="D8" w:val="272727"/>
+      <w:color w:val="000000"/>
+      <w:sz w:val="24"/>
     </w:rPr>
   </w:style>
   <w:style w:styleId="Heading9" w:type="paragraph">
@@ -974,12 +1071,16 @@
     <w:pPr>
       <w:keepNext/>
       <w:keepLines/>
-      <w:spacing w:after="0"/>
+      <w:spacing w:after="80" w:before="200" w:line="240" w:lineRule="auto"/>
+      <w:jc w:val="left"/>
       <w:outlineLvl w:val="8"/>
     </w:pPr>
     <w:rPr>
-      <w:rFonts w:cstheme="majorBidi" w:eastAsiaTheme="majorEastAsia"/>
-      <w:color w:themeColor="text1" w:themeTint="D8" w:val="272727"/>
+      <w:rFonts w:ascii="Times New Roman" w:cs="Times New Roman" w:cstheme="majorBidi" w:eastAsiaTheme="majorEastAsia" w:hAnsi="Times New Roman"/>
+      <w:b/>
+      <w:i/>
+      <w:color w:val="000000"/>
+      <w:sz w:val="24"/>
     </w:rPr>
   </w:style>
   <w:style w:customStyle="1" w:styleId="Heading1Char" w:type="character">
@@ -990,7 +1091,7 @@
     <w:rsid w:val="00A10FD9"/>
     <w:rPr>
       <w:rFonts w:asciiTheme="majorHAnsi" w:cstheme="majorBidi" w:eastAsiaTheme="majorEastAsia" w:hAnsiTheme="majorHAnsi"/>
-      <w:color w:themeColor="accent1" w:themeShade="BF" w:val="0F4761"/>
+      <w:color w:val="000000"/>
       <w:sz w:val="40"/>
       <w:szCs w:val="40"/>
     </w:rPr>
@@ -1004,7 +1105,7 @@
     <w:rsid w:val="00A10FD9"/>
     <w:rPr>
       <w:rFonts w:asciiTheme="majorHAnsi" w:cstheme="majorBidi" w:eastAsiaTheme="majorEastAsia" w:hAnsiTheme="majorHAnsi"/>
-      <w:color w:themeColor="accent1" w:themeShade="BF" w:val="0F4761"/>
+      <w:color w:val="000000"/>
       <w:sz w:val="32"/>
       <w:szCs w:val="32"/>
     </w:rPr>
@@ -1018,7 +1119,7 @@
     <w:rsid w:val="00A10FD9"/>
     <w:rPr>
       <w:rFonts w:cstheme="majorBidi" w:eastAsiaTheme="majorEastAsia"/>
-      <w:color w:themeColor="accent1" w:themeShade="BF" w:val="0F4761"/>
+      <w:color w:val="000000"/>
       <w:sz w:val="28"/>
       <w:szCs w:val="28"/>
     </w:rPr>
@@ -1034,7 +1135,7 @@
       <w:rFonts w:cstheme="majorBidi" w:eastAsiaTheme="majorEastAsia"/>
       <w:i/>
       <w:iCs/>
-      <w:color w:themeColor="accent1" w:themeShade="BF" w:val="0F4761"/>
+      <w:color w:val="000000"/>
     </w:rPr>
   </w:style>
   <w:style w:customStyle="1" w:styleId="Heading5Char" w:type="character">
@@ -1046,7 +1147,7 @@
     <w:rsid w:val="00A10FD9"/>
     <w:rPr>
       <w:rFonts w:cstheme="majorBidi" w:eastAsiaTheme="majorEastAsia"/>
-      <w:color w:themeColor="accent1" w:themeShade="BF" w:val="0F4761"/>
+      <w:color w:val="000000"/>
     </w:rPr>
   </w:style>
   <w:style w:customStyle="1" w:styleId="Heading6Char" w:type="character">
@@ -1060,7 +1161,7 @@
       <w:rFonts w:cstheme="majorBidi" w:eastAsiaTheme="majorEastAsia"/>
       <w:i/>
       <w:iCs/>
-      <w:color w:themeColor="text1" w:themeTint="A6" w:val="595959"/>
+      <w:color w:val="000000"/>
     </w:rPr>
   </w:style>
   <w:style w:customStyle="1" w:styleId="Heading7Char" w:type="character">
@@ -1072,7 +1173,7 @@
     <w:rsid w:val="00A10FD9"/>
     <w:rPr>
       <w:rFonts w:cstheme="majorBidi" w:eastAsiaTheme="majorEastAsia"/>
-      <w:color w:themeColor="text1" w:themeTint="A6" w:val="595959"/>
+      <w:color w:val="000000"/>
     </w:rPr>
   </w:style>
   <w:style w:customStyle="1" w:styleId="Heading8Char" w:type="character">
@@ -1086,7 +1187,7 @@
       <w:rFonts w:cstheme="majorBidi" w:eastAsiaTheme="majorEastAsia"/>
       <w:i/>
       <w:iCs/>
-      <w:color w:themeColor="text1" w:themeTint="D8" w:val="272727"/>
+      <w:color w:val="000000"/>
     </w:rPr>
   </w:style>
   <w:style w:customStyle="1" w:styleId="Heading9Char" w:type="character">
@@ -1098,7 +1199,7 @@
     <w:rsid w:val="00A10FD9"/>
     <w:rPr>
       <w:rFonts w:cstheme="majorBidi" w:eastAsiaTheme="majorEastAsia"/>
-      <w:color w:themeColor="text1" w:themeTint="D8" w:val="272727"/>
+      <w:color w:val="000000"/>
     </w:rPr>
   </w:style>
   <w:style w:styleId="BlockText" w:type="paragraph">
@@ -1109,9 +1210,14 @@
     <w:unhideWhenUsed/>
     <w:qFormat/>
     <w:pPr>
-      <w:spacing w:after="100" w:before="100"/>
+      <w:spacing w:after="200" w:before="0" w:line="240" w:lineRule="auto"/>
       <w:ind w:firstLine="0" w:left="480" w:right="480"/>
-    </w:pPr>
+      <w:jc w:val="left"/>
+    </w:pPr>
+    <w:rPr>
+      <w:rFonts w:ascii="Times New Roman" w:cs="Times New Roman" w:hAnsi="Times New Roman"/>
+      <w:sz w:val="24"/>
+    </w:rPr>
   </w:style>
   <w:style w:styleId="FootnoteText" w:type="paragraph">
     <w:name w:val="Footnote Text"/>
@@ -1120,6 +1226,14 @@
     <w:uiPriority w:val="9"/>
     <w:unhideWhenUsed/>
     <w:qFormat/>
+    <w:pPr>
+      <w:spacing w:after="80" w:before="0" w:line="240" w:lineRule="auto"/>
+      <w:jc w:val="left"/>
+    </w:pPr>
+    <w:rPr>
+      <w:rFonts w:ascii="Times New Roman" w:cs="Times New Roman" w:hAnsi="Times New Roman"/>
+      <w:sz w:val="20"/>
+    </w:rPr>
   </w:style>
   <w:style w:styleId="FootnoteBlockText" w:type="paragraph">
     <w:name w:val="Footnote Block Text"/>
@@ -1144,6 +1258,10 @@
     <w:semiHidden/>
     <w:unhideWhenUsed/>
     <w:qFormat/>
+    <w:rPr>
+      <w:rFonts w:ascii="Times New Roman" w:hAnsi="Times New Roman"/>
+      <w:sz w:val="21"/>
+    </w:rPr>
     <w:tblPr>
       <w:tblInd w:type="dxa" w:w="0"/>
       <w:tblCellMar>
@@ -1152,11 +1270,22 @@
         <w:bottom w:type="dxa" w:w="0"/>
         <w:right w:type="dxa" w:w="108"/>
       </w:tblCellMar>
+      <w:tblBorders>
+        <w:top w:color="000000" w:space="0" w:sz="8" w:val="single"/>
+        <w:bottom w:color="000000" w:space="0" w:sz="8" w:val="single"/>
+        <w:left w:val="nil"/>
+        <w:right w:val="nil"/>
+        <w:insideH w:val="nil"/>
+        <w:insideV w:val="nil"/>
+      </w:tblBorders>
     </w:tblPr>
     <w:tblStylePr w:type="firstRow">
+      <w:rPr>
+        <w:b/>
+      </w:rPr>
       <w:tcPr>
         <w:tcBorders>
-          <w:bottom w:val="single"/>
+          <w:bottom w:color="000000" w:sz="6" w:val="single"/>
         </w:tcBorders>
         <w:vAlign w:val="bottom"/>
       </w:tcPr>
@@ -1184,10 +1313,14 @@
     <w:basedOn w:val="Normal"/>
     <w:link w:val="BodyTextChar"/>
     <w:pPr>
-      <w:spacing w:after="120" w:before="0"/>
-    </w:pPr>
-    <w:rPr>
+      <w:spacing w:after="200" w:before="120" w:line="240" w:lineRule="auto"/>
+      <w:jc w:val="left"/>
+    </w:pPr>
+    <w:rPr>
+      <w:rFonts w:ascii="Times New Roman" w:cs="Times New Roman" w:hAnsi="Times New Roman"/>
+      <w:b/>
       <w:i/>
+      <w:sz w:val="22"/>
     </w:rPr>
   </w:style>
   <w:style w:customStyle="1" w:styleId="TableCaption" w:type="paragraph">
@@ -1195,11 +1328,27 @@
     <w:basedOn w:val="Caption"/>
     <w:pPr>
       <w:keepNext/>
-    </w:pPr>
+      <w:spacing w:after="120" w:before="120" w:line="240" w:lineRule="auto"/>
+      <w:jc w:val="left"/>
+    </w:pPr>
+    <w:rPr>
+      <w:rFonts w:ascii="Times New Roman" w:cs="Times New Roman" w:hAnsi="Times New Roman"/>
+      <w:b/>
+      <w:sz w:val="22"/>
+    </w:rPr>
   </w:style>
   <w:style w:customStyle="1" w:styleId="ImageCaption" w:type="paragraph">
     <w:name w:val="Image Caption"/>
     <w:basedOn w:val="Caption"/>
+    <w:pPr>
+      <w:spacing w:after="200" w:before="120" w:line="240" w:lineRule="auto"/>
+      <w:jc w:val="left"/>
+    </w:pPr>
+    <w:rPr>
+      <w:rFonts w:ascii="Times New Roman" w:cs="Times New Roman" w:hAnsi="Times New Roman"/>
+      <w:b/>
+      <w:sz w:val="22"/>
+    </w:rPr>
   </w:style>
   <w:style w:customStyle="1" w:styleId="Figure" w:type="paragraph">
     <w:name w:val="Figure"/>

</xml_diff>